<commit_message>
docs: 테스트 292개 반영 — CLAUDE.md, 보고서, DOCX 재생성
Co-Authored-By: Claude Opus 4.6 <noreply@anthropic.com>
</commit_message>
<xml_diff>
--- a/docs/report/SDACS_Technical_Report_v2.docx
+++ b/docs/report/SDACS_Technical_Report_v2.docx
@@ -7861,7 +7861,7 @@
                 <w:sz w:val="20"/>
                 <w:szCs w:val="20"/>
               </w:rPr>
-              <w:t xml:space="preserve">270개 (24 모듈)</w:t>
+              <w:t xml:space="preserve">292개 (25 모듈)</w:t>
             </w:r>
           </w:p>
         </w:tc>
@@ -13121,7 +13121,7 @@
                 <w:sz w:val="20"/>
                 <w:szCs w:val="20"/>
               </w:rPr>
-              <w:t xml:space="preserve">pytest 7.4+ (270개 테스트, 24 모듈)</w:t>
+              <w:t xml:space="preserve">pytest 7.4+ (292개 테스트, 25 모듈)</w:t>
             </w:r>
           </w:p>
         </w:tc>
@@ -14075,7 +14075,7 @@
                 <w:sz w:val="20"/>
                 <w:szCs w:val="20"/>
               </w:rPr>
-              <w:t xml:space="preserve">pytest 270개, MC 38,400회, 코드리뷰 25건 수정</w:t>
+              <w:t xml:space="preserve">pytest 292개, MC 38,400회, 코드리뷰 25건 수정</w:t>
             </w:r>
           </w:p>
         </w:tc>
@@ -14500,7 +14500,7 @@
           <w:sz w:val="22"/>
           <w:szCs w:val="22"/>
         </w:rPr>
-        <w:t xml:space="preserve">24개 모듈에 걸쳐 270개의 자동화된 테스트를 구축하였다. 단위 테스트(APF, CPA, RA 등), 통합 테스트(시뮬레이터 E2E), 시나리오 테스트(8개 시나리오 자동 실행)를 포함한다. GitHub Actions CI를 통해 모든 커밋에 자동 테스트가 실행된다.</w:t>
+        <w:t xml:space="preserve">25개 모듈에 걸쳐 292개의 자동화된 테스트를 구축하였다. 단위 테스트(APF, CPA, RA 등), 통합 테스트(시뮬레이터 E2E), 시나리오 테스트(8개 시나리오 자동 실행)를 포함한다. GitHub Actions CI를 통해 모든 커밋에 자동 테스트가 실행된다.</w:t>
       </w:r>
     </w:p>
     <w:p>

</xml_diff>